<commit_message>
feat: updated caseStudy and resume
</commit_message>
<xml_diff>
--- a/app/resume/Pankaj_Dixit_AI_Engineer_Resume.docx
+++ b/app/resume/Pankaj_Dixit_AI_Engineer_Resume.docx
@@ -43,7 +43,7 @@
         </w:rPr>
         <w:t xml:space="preserve">Delhi, India  •  +91 98737 31798  •  </w:t>
       </w:r>
-      <w:hyperlink w:history="1" r:id="rId6e33fpv-zqjy73j4pj_7m">
+      <w:hyperlink w:history="1" r:id="rIdsijovjjt0vimek6n_xugg">
         <w:r>
           <w:rPr>
             <w:rStyle w:val="Hyperlink"/>
@@ -58,7 +58,7 @@
       <w:pPr>
         <w:spacing w:after="60"/>
       </w:pPr>
-      <w:hyperlink w:history="1" r:id="rIdwpsus8zyhlotqzlv7nav8">
+      <w:hyperlink w:history="1" r:id="rIdgktskbtyjnb8xoufyyzrm">
         <w:r>
           <w:rPr>
             <w:rStyle w:val="Hyperlink"/>
@@ -76,7 +76,7 @@
         </w:rPr>
         <w:t xml:space="preserve">  •  </w:t>
       </w:r>
-      <w:hyperlink w:history="1" r:id="rId62dx44mccozjdd3qhjc_1">
+      <w:hyperlink w:history="1" r:id="rIdrc5akkfh6l4ydnnq-kwzm">
         <w:r>
           <w:rPr>
             <w:rStyle w:val="Hyperlink"/>
@@ -94,7 +94,7 @@
         </w:rPr>
         <w:t xml:space="preserve">  •  </w:t>
       </w:r>
-      <w:hyperlink w:history="1" r:id="rIdqiflw8jfkfybtdjb7qcaw">
+      <w:hyperlink w:history="1" r:id="rIdw3abi1jtchf2kii6u2mlq">
         <w:r>
           <w:rPr>
             <w:rStyle w:val="Hyperlink"/>
@@ -371,58 +371,58 @@
           <w:sz w:val="20"/>
           <w:szCs w:val="20"/>
         </w:rPr>
-        <w:t xml:space="preserve">Built a production MCP (Model Context Protocol) server in TypeScript with 21 AI-powered tools, integrated with GitHub Copilot in VS Code, automating developer onboarding (VPN/PIM access, Docker, IIS, certificates, build, linting) and cutting setup from 2 weeks to under 30 minutes, saving 80+ hours per new developer.</w:t>
-      </w:r>
-    </w:p>
-    <w:p>
-      <w:pPr>
-        <w:pStyle w:val="ListParagraph"/>
-        <w:numPr>
-          <w:ilvl w:val="0"/>
-          <w:numId w:val="2"/>
-        </w:numPr>
-        <w:spacing w:after="60"/>
-      </w:pPr>
-      <w:r>
-        <w:rPr>
-          <w:sz w:val="20"/>
-          <w:szCs w:val="20"/>
-        </w:rPr>
-        <w:t xml:space="preserve">Engineered the support-critical parts of that automation: Node version isolation, dynamic IP detection and propagation, automated time-limited Azure PIM role activation via REST API, and a self-healing daily environment health check.</w:t>
-      </w:r>
-    </w:p>
-    <w:p>
-      <w:pPr>
-        <w:pStyle w:val="ListParagraph"/>
-        <w:numPr>
-          <w:ilvl w:val="0"/>
-          <w:numId w:val="2"/>
-        </w:numPr>
-        <w:spacing w:after="60"/>
-      </w:pPr>
-      <w:r>
-        <w:rPr>
-          <w:sz w:val="20"/>
-          <w:szCs w:val="20"/>
-        </w:rPr>
-        <w:t xml:space="preserve">Architected IncidentIQ, an agentic AI incident-response pipeline (Microsoft Agent Framework, Azure OpenAI, RAG over past incidents via Azure AI Search) that turns a production alert into a draft, merge-ready PR with mandatory human review. CodeRush 2026 Finalist (Top 6 of 70+).</w:t>
-      </w:r>
-    </w:p>
-    <w:p>
-      <w:pPr>
-        <w:pStyle w:val="ListParagraph"/>
-        <w:numPr>
-          <w:ilvl w:val="0"/>
-          <w:numId w:val="2"/>
-        </w:numPr>
-        <w:spacing w:after="60"/>
-      </w:pPr>
-      <w:r>
-        <w:rPr>
-          <w:sz w:val="20"/>
-          <w:szCs w:val="20"/>
-        </w:rPr>
-        <w:t xml:space="preserve">Designed and built ShieldAI, an AI-augmented pre-release CD gate (Playwright + GitHub Models / Azure OpenAI) where deterministic checks block and AI only advises, catching 5 classes of production breakage in ~30 seconds, with 51 passing tests.</w:t>
+        <w:t xml:space="preserve">Built a production MCP (Model Context Protocol) server in TypeScript with 21 AI-powered tools, integrated with GitHub Copilot in VS Code, automating developer onboarding and cutting setup from 2 weeks to under 30 minutes, saving 80+ hours per new developer.</w:t>
+      </w:r>
+    </w:p>
+    <w:p>
+      <w:pPr>
+        <w:pStyle w:val="ListParagraph"/>
+        <w:numPr>
+          <w:ilvl w:val="0"/>
+          <w:numId w:val="2"/>
+        </w:numPr>
+        <w:spacing w:after="60"/>
+      </w:pPr>
+      <w:r>
+        <w:rPr>
+          <w:sz w:val="20"/>
+          <w:szCs w:val="20"/>
+        </w:rPr>
+        <w:t xml:space="preserve">Engineered the reliability layer behind that automation, including automated Azure access provisioning and a self-healing daily environment health check.</w:t>
+      </w:r>
+    </w:p>
+    <w:p>
+      <w:pPr>
+        <w:pStyle w:val="ListParagraph"/>
+        <w:numPr>
+          <w:ilvl w:val="0"/>
+          <w:numId w:val="2"/>
+        </w:numPr>
+        <w:spacing w:after="60"/>
+      </w:pPr>
+      <w:r>
+        <w:rPr>
+          <w:sz w:val="20"/>
+          <w:szCs w:val="20"/>
+        </w:rPr>
+        <w:t xml:space="preserve">Architected IncidentIQ, an agentic AI incident-response pipeline (Microsoft Agent Framework, Azure OpenAI, RAG via Azure AI Search) that turns a production alert into a draft, merge-ready pull request with mandatory human review. CodeRush 2026 Finalist, Top 6 of 70+.</w:t>
+      </w:r>
+    </w:p>
+    <w:p>
+      <w:pPr>
+        <w:pStyle w:val="ListParagraph"/>
+        <w:numPr>
+          <w:ilvl w:val="0"/>
+          <w:numId w:val="2"/>
+        </w:numPr>
+        <w:spacing w:after="60"/>
+      </w:pPr>
+      <w:r>
+        <w:rPr>
+          <w:sz w:val="20"/>
+          <w:szCs w:val="20"/>
+        </w:rPr>
+        <w:t xml:space="preserve">Designed and built ShieldAI, an AI-augmented pre-release deployment gate (Playwright, GitHub Models, Azure OpenAI) where deterministic checks block the release and AI only advises, catching visual regressions, dependency failures, and API errors in about 30 seconds.</w:t>
       </w:r>
     </w:p>
     <w:p>
@@ -456,7 +456,7 @@
           <w:sz w:val="20"/>
           <w:szCs w:val="20"/>
         </w:rPr>
-        <w:t xml:space="preserve">Leading the React 18 + TypeScript migration of a legacy Angular 1.x admin portal (~20 pages) in a Yarn-workspaces monorepo, with zero backend changes and reusable patterns adopted across the team.</w:t>
+        <w:t xml:space="preserve">Leading the React 18 and TypeScript migration of a legacy Angular 1.x admin portal (20+ pages) with zero backend changes and reusable patterns adopted across the team.</w:t>
       </w:r>
     </w:p>
     <w:p>
@@ -793,7 +793,7 @@
           <w:sz w:val="20"/>
           <w:szCs w:val="20"/>
         </w:rPr>
-        <w:t xml:space="preserve">GitHub Copilot Certification (2026) · AI White Belt · Prompt Engineering for Everyone (2025) · Claude Code 101 · Introduction to Generative AI · Introduction to Large Language Models · Introduction to AI &amp; ML on Google Cloud · MLOps (Getting Started, for Generative AI, Vertex AI Model Evaluation) · Create ML Models with BigQuery ML · Python Programming (2025) · Scrum Master with Jira · Front-End Web Development (Udacity) · JavaScript &amp; CSS (HackerRank)</w:t>
+        <w:t xml:space="preserve">GitHub Copilot Certification (2026) · Claude Code 101 · AI White Belt · Prompt Engineering for Everyone (2025) · Google Cloud: Generative AI, LLMs, MLOps with Vertex AI, BigQuery ML · Python Programming (2025) · Scrum Master with Jira</w:t>
       </w:r>
     </w:p>
     <w:p>
@@ -863,7 +863,7 @@
           <w:sz w:val="20"/>
           <w:szCs w:val="20"/>
         </w:rPr>
-        <w:t xml:space="preserve">Multiple Pat on the Back awards from the Tech Mahindra IBU head, plus direct appreciation from Microsoft stakeholders.</w:t>
+        <w:t xml:space="preserve">Multiple awards from Tech Mahindra leadership and direct appreciation from Microsoft stakeholders.</w:t>
       </w:r>
     </w:p>
     <w:p>

</xml_diff>